<commit_message>
更新可视化配色: 采用 NPG (Nature Publishing Group) + Okabe-Ito 色盲友好色板
- 散点图: NPG 红/绿/深蓝 + 不同标记 (o/s/^) 区分簇
- 箱线图: violin + box overlay, NPG 四色
- 热力图: viridis (Nature 推荐的感知均匀色带)
- 条形图: NPG 深蓝 vs 红 水平条形
- 环形图: NPG 绿/红/淡橙/深蓝
- 字体: Arial/Helvetica (Nature 推荐 sans-serif)

https://claude.ai/code/session_01Lv2LunBRvHy72bFhoMpCZ9
</commit_message>
<xml_diff>
--- a/实验4代码/机器学习实验四_聚类算法与性能度量_报告.docx
+++ b/实验4代码/机器学习实验四_聚类算法与性能度量_报告.docx
@@ -1000,7 +1000,7 @@
       <w:r>
         <w:drawing>
           <wp:inline xmlns:a="http://schemas.openxmlformats.org/drawingml/2006/main" xmlns:pic="http://schemas.openxmlformats.org/drawingml/2006/picture">
-            <wp:extent cx="5029200" cy="2564476"/>
+            <wp:extent cx="5029200" cy="2410883"/>
             <wp:docPr id="1" name="Picture 1"/>
             <wp:cNvGraphicFramePr>
               <a:graphicFrameLocks noChangeAspect="1"/>
@@ -1021,7 +1021,7 @@
                   <pic:spPr>
                     <a:xfrm>
                       <a:off x="0" y="0"/>
-                      <a:ext cx="5029200" cy="2564476"/>
+                      <a:ext cx="5029200" cy="2410883"/>
                     </a:xfrm>
                     <a:prstGeom prst="rect"/>
                   </pic:spPr>
@@ -1275,7 +1275,7 @@
       <w:r>
         <w:drawing>
           <wp:inline xmlns:a="http://schemas.openxmlformats.org/drawingml/2006/main" xmlns:pic="http://schemas.openxmlformats.org/drawingml/2006/picture">
-            <wp:extent cx="5029200" cy="2270692"/>
+            <wp:extent cx="5029200" cy="2203765"/>
             <wp:docPr id="2" name="Picture 2"/>
             <wp:cNvGraphicFramePr>
               <a:graphicFrameLocks noChangeAspect="1"/>
@@ -1296,7 +1296,7 @@
                   <pic:spPr>
                     <a:xfrm>
                       <a:off x="0" y="0"/>
-                      <a:ext cx="5029200" cy="2270692"/>
+                      <a:ext cx="5029200" cy="2203765"/>
                     </a:xfrm>
                     <a:prstGeom prst="rect"/>
                   </pic:spPr>
@@ -2038,7 +2038,7 @@
       <w:r>
         <w:drawing>
           <wp:inline xmlns:a="http://schemas.openxmlformats.org/drawingml/2006/main" xmlns:pic="http://schemas.openxmlformats.org/drawingml/2006/picture">
-            <wp:extent cx="5029200" cy="2095925"/>
+            <wp:extent cx="5029200" cy="2123440"/>
             <wp:docPr id="3" name="Picture 3"/>
             <wp:cNvGraphicFramePr>
               <a:graphicFrameLocks noChangeAspect="1"/>
@@ -2059,7 +2059,7 @@
                   <pic:spPr>
                     <a:xfrm>
                       <a:off x="0" y="0"/>
-                      <a:ext cx="5029200" cy="2095925"/>
+                      <a:ext cx="5029200" cy="2123440"/>
                     </a:xfrm>
                     <a:prstGeom prst="rect"/>
                   </pic:spPr>
@@ -2564,7 +2564,7 @@
       <w:r>
         <w:drawing>
           <wp:inline xmlns:a="http://schemas.openxmlformats.org/drawingml/2006/main" xmlns:pic="http://schemas.openxmlformats.org/drawingml/2006/picture">
-            <wp:extent cx="5486400" cy="1725051"/>
+            <wp:extent cx="5486400" cy="1544320"/>
             <wp:docPr id="4" name="Picture 4"/>
             <wp:cNvGraphicFramePr>
               <a:graphicFrameLocks noChangeAspect="1"/>
@@ -2585,7 +2585,7 @@
                   <pic:spPr>
                     <a:xfrm>
                       <a:off x="0" y="0"/>
-                      <a:ext cx="5486400" cy="1725051"/>
+                      <a:ext cx="5486400" cy="1544320"/>
                     </a:xfrm>
                     <a:prstGeom prst="rect"/>
                   </pic:spPr>
@@ -2636,7 +2636,7 @@
       <w:r>
         <w:drawing>
           <wp:inline xmlns:a="http://schemas.openxmlformats.org/drawingml/2006/main" xmlns:pic="http://schemas.openxmlformats.org/drawingml/2006/picture">
-            <wp:extent cx="5029200" cy="2160659"/>
+            <wp:extent cx="5029200" cy="2939076"/>
             <wp:docPr id="5" name="Picture 5"/>
             <wp:cNvGraphicFramePr>
               <a:graphicFrameLocks noChangeAspect="1"/>
@@ -2657,7 +2657,7 @@
                   <pic:spPr>
                     <a:xfrm>
                       <a:off x="0" y="0"/>
-                      <a:ext cx="5029200" cy="2160659"/>
+                      <a:ext cx="5029200" cy="2939076"/>
                     </a:xfrm>
                     <a:prstGeom prst="rect"/>
                   </pic:spPr>
@@ -2681,7 +2681,7 @@
       <w:r>
         <w:drawing>
           <wp:inline xmlns:a="http://schemas.openxmlformats.org/drawingml/2006/main" xmlns:pic="http://schemas.openxmlformats.org/drawingml/2006/picture">
-            <wp:extent cx="5486400" cy="1642887"/>
+            <wp:extent cx="5486400" cy="1477108"/>
             <wp:docPr id="6" name="Picture 6"/>
             <wp:cNvGraphicFramePr>
               <a:graphicFrameLocks noChangeAspect="1"/>
@@ -2702,7 +2702,7 @@
                   <pic:spPr>
                     <a:xfrm>
                       <a:off x="0" y="0"/>
-                      <a:ext cx="5486400" cy="1642887"/>
+                      <a:ext cx="5486400" cy="1477108"/>
                     </a:xfrm>
                     <a:prstGeom prst="rect"/>
                   </pic:spPr>
@@ -2735,7 +2735,7 @@
       <w:r>
         <w:drawing>
           <wp:inline xmlns:a="http://schemas.openxmlformats.org/drawingml/2006/main" xmlns:pic="http://schemas.openxmlformats.org/drawingml/2006/picture">
-            <wp:extent cx="5029200" cy="3255351"/>
+            <wp:extent cx="5029200" cy="3108960"/>
             <wp:docPr id="7" name="Picture 7"/>
             <wp:cNvGraphicFramePr>
               <a:graphicFrameLocks noChangeAspect="1"/>
@@ -2756,7 +2756,7 @@
                   <pic:spPr>
                     <a:xfrm>
                       <a:off x="0" y="0"/>
-                      <a:ext cx="5029200" cy="3255351"/>
+                      <a:ext cx="5029200" cy="3108960"/>
                     </a:xfrm>
                     <a:prstGeom prst="rect"/>
                   </pic:spPr>

</xml_diff>